<commit_message>
refactor(tutorial-02a): remplacement du point 4 par '4. Rédigez vos conclusions'
</commit_message>
<xml_diff>
--- a/docs/public/documents/Exercice-02a-Tutoriel.docx
+++ b/docs/public/documents/Exercice-02a-Tutoriel.docx
@@ -64,7 +64,7 @@
           <w:b/>
           <w:i w:val="0"/>
         </w:rPr>
-        <w:t>Les 5 grandes étapes de réalisation :</w:t>
+        <w:t>Les 4 grandes étapes de réalisation :</w:t>
       </w:r>
     </w:p>
     <w:p>
@@ -127,7 +127,7 @@
     <w:p>
       <w:pPr>
         <w:pStyle w:val="ListBullet"/>
-        <w:spacing w:before="0" w:after="60" w:line="276" w:lineRule="auto"/>
+        <w:spacing w:before="0" w:after="240" w:line="276" w:lineRule="auto"/>
       </w:pPr>
       <w:r>
         <w:rPr>
@@ -140,26 +140,7 @@
         <w:rPr>
           <w:rFonts w:ascii="Segoe UI" w:hAnsi="Segoe UI"/>
         </w:rPr>
-        <w:t>Programmation de la règle d'alerte conditionnelle de déficit énergétique</w:t>
-      </w:r>
-    </w:p>
-    <w:p>
-      <w:pPr>
-        <w:pStyle w:val="ListBullet"/>
-        <w:spacing w:before="0" w:after="240" w:line="276" w:lineRule="auto"/>
-      </w:pPr>
-      <w:r>
-        <w:rPr>
-          <w:rFonts w:ascii="Segoe UI" w:hAnsi="Segoe UI"/>
-          <w:b/>
-        </w:rPr>
-        <w:t xml:space="preserve">Étape 5 : </w:t>
-      </w:r>
-      <w:r>
-        <w:rPr>
-          <w:rFonts w:ascii="Segoe UI" w:hAnsi="Segoe UI"/>
-        </w:rPr>
-        <w:t>Chargement dans Excel, vérification de la dynamicité et analyse décisionnelle pour le staff</w:t>
+        <w:t>Rédigez vos conclusions</w:t>
       </w:r>
     </w:p>
     <w:p>
@@ -587,7 +568,7 @@
     </w:p>
     <w:p>
       <w:pPr>
-        <w:spacing w:before="0" w:after="200" w:line="276" w:lineRule="auto"/>
+        <w:spacing w:before="0" w:after="120" w:line="276" w:lineRule="auto"/>
       </w:pPr>
       <w:r>
         <w:rPr>
@@ -600,6 +581,19 @@
     </w:p>
     <w:p>
       <w:pPr>
+        <w:spacing w:before="0" w:after="200" w:line="276" w:lineRule="auto"/>
+      </w:pPr>
+      <w:r>
+        <w:rPr>
+          <w:rFonts w:ascii="Segoe UI" w:hAnsi="Segoe UI"/>
+          <w:b w:val="0"/>
+          <w:i w:val="0"/>
+        </w:rPr>
+        <w:t>Chargement dans Excel : Dans l'onglet Accueil de Power Query, cliquez sur Fermer et charger &gt; Fermer et charger dans... Choisissez Tableau dans une Nouvelle feuille nommée « Extraction_PowerQuery ».</w:t>
+      </w:r>
+    </w:p>
+    <w:p>
+      <w:pPr>
         <w:spacing w:before="280" w:after="120" w:line="276" w:lineRule="auto"/>
       </w:pPr>
       <w:r>
@@ -608,7 +602,7 @@
           <w:b/>
           <w:sz w:val="26"/>
         </w:rPr>
-        <w:t>Étape 4 : Programmation de l'Alerte Conditionnelle de Déficit Énergétique</w:t>
+        <w:t>4. Rédigez vos conclusions</w:t>
       </w:r>
     </w:p>
     <w:p>
@@ -621,46 +615,7 @@
           <w:b w:val="0"/>
           <w:i w:val="0"/>
         </w:rPr>
-        <w:t>Pour automatiser la détection des journées à haut risque de déplétion glycogénique et de fatigue anormale, nous créons une alerte visuelle automatique dès qu'une séance présente une charge RPE élevée (&gt;= 600 UA) associée à un apport glucidique inférieur à 6.0 g/kg.</w:t>
-      </w:r>
-    </w:p>
-    <w:p>
-      <w:pPr>
-        <w:spacing w:before="0" w:after="120" w:line="276" w:lineRule="auto"/>
-      </w:pPr>
-      <w:r>
-        <w:rPr>
-          <w:rFonts w:ascii="Segoe UI" w:hAnsi="Segoe UI"/>
-          <w:b w:val="0"/>
-          <w:i w:val="0"/>
-        </w:rPr>
-        <w:t>1. Toujours dans l'onglet Ajouter une colonne, cliquez sur Colonne conditionnelle.</w:t>
-      </w:r>
-    </w:p>
-    <w:p>
-      <w:pPr>
-        <w:spacing w:before="0" w:after="120" w:line="276" w:lineRule="auto"/>
-      </w:pPr>
-      <w:r>
-        <w:rPr>
-          <w:rFonts w:ascii="Segoe UI" w:hAnsi="Segoe UI"/>
-          <w:b w:val="0"/>
-          <w:i w:val="0"/>
-        </w:rPr>
-        <w:t>2. Nommez la colonne « Alerte_Glucides ».</w:t>
-      </w:r>
-    </w:p>
-    <w:p>
-      <w:pPr>
-        <w:spacing w:before="0" w:after="120" w:line="276" w:lineRule="auto"/>
-      </w:pPr>
-      <w:r>
-        <w:rPr>
-          <w:rFonts w:ascii="Segoe UI" w:hAnsi="Segoe UI"/>
-          <w:b w:val="0"/>
-          <w:i w:val="0"/>
-        </w:rPr>
-        <w:t>3. Configurez la règle de test logique ainsi :</w:t>
+        <w:t>À partir de votre tableau extrait sous Excel et en consultant l'onglet « Profils_Reperes_Staff », analysez les données et rédigez vos conclusions (sur une feuille dédiée ou dans un document Word) en répondant précisément aux 4 questions professionnelles suivantes :</w:t>
       </w:r>
     </w:p>
     <w:p>
@@ -673,13 +628,13 @@
           <w:rFonts w:ascii="Segoe UI" w:hAnsi="Segoe UI"/>
           <w:b/>
         </w:rPr>
-        <w:t xml:space="preserve">Condition 1 : </w:t>
+        <w:t xml:space="preserve">Question 1 — Disponibilité énergétique &amp; Glucides : </w:t>
       </w:r>
       <w:r>
         <w:rPr>
           <w:rFonts w:ascii="Segoe UI" w:hAnsi="Segoe UI"/>
         </w:rPr>
-        <w:t>Sélectionnez la colonne [Charge_RPE_UA] | Opérateur : « est supérieur ou égal à » | Valeur : 600</w:t>
+        <w:t>Comparez les apports glucidiques journaliers rapportés au poids corporel (g/kg/j) lors des séances à haute charge (Mardi et Jeudi, charge RPE &gt; 600 UA). Identifiez les athlètes qui descendent sous le seuil critique (&lt; 6.0 g/kg/j, comme Camille Bernard le jeudi à 5.0 g/kg avec une récupération 'Fatigué'). Expliquez les conséquences physiologiques directes sur la resynthèse du glycogène intramusculaire et la perte de puissance lors des séries lactiques à haute intensité.</w:t>
       </w:r>
     </w:p>
     <w:p>
@@ -692,13 +647,13 @@
           <w:rFonts w:ascii="Segoe UI" w:hAnsi="Segoe UI"/>
           <w:b/>
         </w:rPr>
-        <w:t xml:space="preserve">Condition 2 : </w:t>
+        <w:t xml:space="preserve">Question 2 — Récupération protéique &amp; Force : </w:t>
       </w:r>
       <w:r>
         <w:rPr>
           <w:rFonts w:ascii="Segoe UI" w:hAnsi="Segoe UI"/>
         </w:rPr>
-        <w:t>Cliquez sur Ajouter une clause. Sélectionnez [Glucides_g_kg] | Opérateur : « est inférieur à » | Valeur : 6</w:t>
+        <w:t>Vérifiez si les cibles recommandées (1.6 à 2.2 g/kg/j) sont couvertes pour les athlètes ayant un profil de puissance et de renforcement musculaire (Maxime Laurent, Alexandre Faure, Emma Roux). Justifiez l'importance stratégique du timing d'ingestion d'une collation riche en acides aminés essentiels / leucine (20 à 30 g) dans les 45 minutes suivant la séance de musculation.</w:t>
       </w:r>
     </w:p>
     <w:p>
@@ -711,167 +666,13 @@
           <w:rFonts w:ascii="Segoe UI" w:hAnsi="Segoe UI"/>
           <w:b/>
         </w:rPr>
-        <w:t xml:space="preserve">Résultat si VRAI : </w:t>
+        <w:t xml:space="preserve">Question 3 — Hydratation &amp; Thermorégulation : </w:t>
       </w:r>
       <w:r>
         <w:rPr>
           <w:rFonts w:ascii="Segoe UI" w:hAnsi="Segoe UI"/>
         </w:rPr>
-        <w:t>Dans la case « Sortie », écrivez : Alerte Déficit</w:t>
-      </w:r>
-    </w:p>
-    <w:p>
-      <w:pPr>
-        <w:pStyle w:val="ListBullet"/>
-        <w:spacing w:before="0" w:after="60" w:line="276" w:lineRule="auto"/>
-      </w:pPr>
-      <w:r>
-        <w:rPr>
-          <w:rFonts w:ascii="Segoe UI" w:hAnsi="Segoe UI"/>
-          <w:b/>
-        </w:rPr>
-        <w:t xml:space="preserve">Résultat par défaut : </w:t>
-      </w:r>
-      <w:r>
-        <w:rPr>
-          <w:rFonts w:ascii="Segoe UI" w:hAnsi="Segoe UI"/>
-        </w:rPr>
-        <w:t>Dans la case « Sinon » (en bas), écrivez : Conforme</w:t>
-      </w:r>
-    </w:p>
-    <w:p>
-      <w:pPr>
-        <w:spacing w:before="0" w:after="200" w:line="276" w:lineRule="auto"/>
-      </w:pPr>
-      <w:r>
-        <w:rPr>
-          <w:rFonts w:ascii="Segoe UI" w:hAnsi="Segoe UI"/>
-          <w:b w:val="0"/>
-          <w:i w:val="0"/>
-        </w:rPr>
-        <w:t>4. Cliquez sur OK. La colonne indique immédiatement « Alerte Déficit » pour les journées critiques (ex : Camille Bernard le Jeudi 09/10).</w:t>
-      </w:r>
-    </w:p>
-    <w:p>
-      <w:pPr>
-        <w:spacing w:before="280" w:after="120" w:line="276" w:lineRule="auto"/>
-      </w:pPr>
-      <w:r>
-        <w:rPr>
-          <w:rFonts w:ascii="Segoe UI" w:hAnsi="Segoe UI"/>
-          <w:b/>
-          <w:sz w:val="26"/>
-        </w:rPr>
-        <w:t>Étape 5 : Chargement dans Excel et Guide d'Interprétation Staff</w:t>
-      </w:r>
-    </w:p>
-    <w:p>
-      <w:pPr>
-        <w:spacing w:before="0" w:after="120" w:line="276" w:lineRule="auto"/>
-      </w:pPr>
-      <w:r>
-        <w:rPr>
-          <w:rFonts w:ascii="Segoe UI" w:hAnsi="Segoe UI"/>
-          <w:b w:val="0"/>
-          <w:i w:val="0"/>
-        </w:rPr>
-        <w:t>1. Dans l'onglet Accueil de Power Query, cliquez sur la flèche sous le bouton Fermer et charger &gt; Fermer et charger dans...</w:t>
-      </w:r>
-    </w:p>
-    <w:p>
-      <w:pPr>
-        <w:spacing w:before="0" w:after="120" w:line="276" w:lineRule="auto"/>
-      </w:pPr>
-      <w:r>
-        <w:rPr>
-          <w:rFonts w:ascii="Segoe UI" w:hAnsi="Segoe UI"/>
-          <w:b w:val="0"/>
-          <w:i w:val="0"/>
-        </w:rPr>
-        <w:t>2. Choisissez Tableau, puis Nouvelle feuille de calcul. Nommez l'onglet créé : « Extraction_PowerQuery ».</w:t>
-      </w:r>
-    </w:p>
-    <w:p>
-      <w:pPr>
-        <w:spacing w:before="0" w:after="120" w:line="276" w:lineRule="auto"/>
-      </w:pPr>
-      <w:r>
-        <w:rPr>
-          <w:rFonts w:ascii="Segoe UI" w:hAnsi="Segoe UI"/>
-          <w:b w:val="0"/>
-          <w:i w:val="0"/>
-        </w:rPr>
-        <w:t>3. Dans Excel, vérifiez la mise en forme des colonnes (sélectionnez les colonnes des ratios et appliquez le format Nombre à 1 décimale).</w:t>
-      </w:r>
-    </w:p>
-    <w:p>
-      <w:pPr>
-        <w:spacing w:before="0" w:after="120" w:line="276" w:lineRule="auto"/>
-      </w:pPr>
-      <w:r>
-        <w:rPr>
-          <w:rFonts w:ascii="Segoe UI" w:hAnsi="Segoe UI"/>
-          <w:b w:val="0"/>
-          <w:i w:val="0"/>
-        </w:rPr>
-        <w:t>4. Rédigez vos conclusions dans un second onglet ou un document Word en suivant la grille d'aide ci-dessous :</w:t>
-      </w:r>
-    </w:p>
-    <w:p>
-      <w:pPr>
-        <w:pStyle w:val="ListBullet"/>
-        <w:spacing w:before="0" w:after="60" w:line="276" w:lineRule="auto"/>
-      </w:pPr>
-      <w:r>
-        <w:rPr>
-          <w:rFonts w:ascii="Segoe UI" w:hAnsi="Segoe UI"/>
-          <w:b/>
-        </w:rPr>
-        <w:t xml:space="preserve">Aide Question 1 (Glucides &amp; RED-S) : </w:t>
-      </w:r>
-      <w:r>
-        <w:rPr>
-          <w:rFonts w:ascii="Segoe UI" w:hAnsi="Segoe UI"/>
-        </w:rPr>
-        <w:t>Comparez les journées de Mardi et Jeudi (charge RPE &gt; 600 UA, volume &gt; 6 km). Remarquez le profil de Camille Bernard (5.0 g/kg le jeudi avec une récupération 'Fatigué') et de Lucas Mercier (8.9 g/kg en demi-fond). Expliquez pourquoi un apport &lt; 6 g/kg réduit la resynthèse du glycogène musculaire, baisse l'intensité de pointe sur les répétitions lactiques et élève le risque de blessure tendineuse.</w:t>
-      </w:r>
-    </w:p>
-    <w:p>
-      <w:pPr>
-        <w:pStyle w:val="ListBullet"/>
-        <w:spacing w:before="0" w:after="60" w:line="276" w:lineRule="auto"/>
-      </w:pPr>
-      <w:r>
-        <w:rPr>
-          <w:rFonts w:ascii="Segoe UI" w:hAnsi="Segoe UI"/>
-          <w:b/>
-        </w:rPr>
-        <w:t xml:space="preserve">Aide Question 2 (Protéines &amp; Musculation) : </w:t>
-      </w:r>
-      <w:r>
-        <w:rPr>
-          <w:rFonts w:ascii="Segoe UI" w:hAnsi="Segoe UI"/>
-        </w:rPr>
-        <w:t>Analysez les apports protéiques d'Alexandre Faure et Maxime Laurent (souvent &gt; 2.1 g/kg/j). Validez que le total est optimal pour l'hypertrophie et la réparation myo-fibrillaire. Soulignez la recommandation du timing : ingestion d'une collation de 20 à 30 g de protéines riches en leucine dans les 45 minutes suivant la musculation.</w:t>
-      </w:r>
-    </w:p>
-    <w:p>
-      <w:pPr>
-        <w:pStyle w:val="ListBullet"/>
-        <w:spacing w:before="0" w:after="60" w:line="276" w:lineRule="auto"/>
-      </w:pPr>
-      <w:r>
-        <w:rPr>
-          <w:rFonts w:ascii="Segoe UI" w:hAnsi="Segoe UI"/>
-          <w:b/>
-        </w:rPr>
-        <w:t xml:space="preserve">Aide Question 3 (Hydratation de terrain) : </w:t>
-      </w:r>
-      <w:r>
-        <w:rPr>
-          <w:rFonts w:ascii="Segoe UI" w:hAnsi="Segoe UI"/>
-        </w:rPr>
-        <w:t>Comparez l'apport hydrique par rapport aux kilomètres nagés. En milieu aquatique, la sudation est invisible mais bien réelle (0.5 à 1.2 L/h). Une déshydratation de 2 % de masse corporelle élève la fréquence cardiaque à l'effort et augmente artificiellement la perception de l'effort (RPE).</w:t>
+        <w:t>Croisez les volumes hydriques déclarés (L/j) avec les kilométrages nagés en bassin (souvent &gt; 10 km/j pour les demi-fondistes comme Lucas Mercier et Sarah Lefebvre). Rappelez pourquoi la déshydratation est sous-estimée en milieu aquatique (sudation masquée par l'eau) et démontrez son impact sur la dérive cardiovasculaire et l'élévation anormale de la perception de l'effort (RPE).</w:t>
       </w:r>
     </w:p>
     <w:p>
@@ -884,13 +685,13 @@
           <w:rFonts w:ascii="Segoe UI" w:hAnsi="Segoe UI"/>
           <w:b/>
         </w:rPr>
-        <w:t xml:space="preserve">Aide Question 4 (Ajustements staff) : </w:t>
+        <w:t xml:space="preserve">Question 4 — Recommandations pour le staff : </w:t>
       </w:r>
       <w:r>
         <w:rPr>
           <w:rFonts w:ascii="Segoe UI" w:hAnsi="Segoe UI"/>
         </w:rPr>
-        <w:t>Formulez des consignes pragmatiques : ajuster les collations glucidiques liquides d'intra-séance (boisson d'effort isotonique), surveiller le poids matinal post-miction, et individualiser les rations lors des jours de biquotidiens.</w:t>
+        <w:t>Formulez 3 recommandations nutritionnelles concrètes, individualisées et opérationnelles destinées à l'entraîneur principal et aux nageurs pour la semaine suivante : mise en place d'une boisson d'effort isotonique d'intra-séance, ajustement des collations de récupération post-bassin et protocole de pesée matinale pour surveiller l'état d'hydratation.</w:t>
       </w:r>
     </w:p>
     <w:p>
@@ -903,7 +704,7 @@
           <w:b/>
           <w:i/>
         </w:rPr>
-        <w:t>Fin du tutoriel — Vous disposez d'une chaîne automatisée reproductible tout au long de la saison sportive.</w:t>
+        <w:t>Fin du tutoriel — Vous disposez d'un flux automatisé et d'une analyse d'aide à la décision rigoureuse pour le staff.</w:t>
       </w:r>
     </w:p>
     <w:sectPr>

</xml_diff>